<commit_message>
feat: add document generation utility for project reports using docx.js
</commit_message>
<xml_diff>
--- a/documentation/Mini_Project_EMARL_SAR_257y1d5805.docx
+++ b/documentation/Mini_Project_EMARL_SAR_257y1d5805.docx
@@ -808,10 +808,10 @@
                   <v:path o:extrusionok="f" gradientshapeok="t" o:connecttype="rect"/>
                   <o:lock v:ext="edit" aspectratio="t"/>
                 </v:shapetype>
-                <v:shape id="_x0000_i1071" type="#_x0000_t75" style="width:144.7pt;height:130.3pt" o:ole="">
+                <v:shape id="_x0000_i1025" type="#_x0000_t75" style="width:145.1pt;height:129.8pt" o:ole="">
                   <v:imagedata r:id="rId8" o:title=""/>
                 </v:shape>
-                <o:OLEObject Type="Embed" ProgID="PBrush" ShapeID="_x0000_i1071" DrawAspect="Content" ObjectID="_1842874802" r:id="rId9"/>
+                <o:OLEObject Type="Embed" ProgID="PBrush" ShapeID="_x0000_i1025" DrawAspect="Content" ObjectID="_1842892957" r:id="rId9"/>
               </w:object>
             </w:r>
           </w:p>
@@ -1139,10 +1139,10 @@
             </w:pPr>
             <w:r>
               <w:object w:dxaOrig="2892" w:dyaOrig="2604" w14:anchorId="1D794E3B">
-                <v:shape id="_x0000_i1072" type="#_x0000_t75" style="width:112.45pt;height:101.5pt" o:ole="">
+                <v:shape id="_x0000_i1026" type="#_x0000_t75" style="width:112.35pt;height:101.45pt" o:ole="">
                   <v:imagedata r:id="rId8" o:title=""/>
                 </v:shape>
-                <o:OLEObject Type="Embed" ProgID="PBrush" ShapeID="_x0000_i1072" DrawAspect="Content" ObjectID="_1842874803" r:id="rId12"/>
+                <o:OLEObject Type="Embed" ProgID="PBrush" ShapeID="_x0000_i1026" DrawAspect="Content" ObjectID="_1842892958" r:id="rId12"/>
               </w:object>
             </w:r>
           </w:p>
@@ -2436,23 +2436,7 @@
           <w:rFonts w:eastAsia="SimSun"/>
           <w:color w:val="000000"/>
         </w:rPr>
-        <w:t xml:space="preserve">, Department of Computer Science </w:t>
-      </w:r>
-      <w:proofErr w:type="gramStart"/>
-      <w:r>
-        <w:rPr>
-          <w:rFonts w:eastAsia="SimSun"/>
-          <w:color w:val="000000"/>
-        </w:rPr>
-        <w:t>And</w:t>
-      </w:r>
-      <w:proofErr w:type="gramEnd"/>
-      <w:r>
-        <w:rPr>
-          <w:rFonts w:eastAsia="SimSun"/>
-          <w:color w:val="000000"/>
-        </w:rPr>
-        <w:t xml:space="preserve"> Engineering, for his excellent guidance and invaluable support, </w:t>
+        <w:t xml:space="preserve">, Department of Computer Science And Engineering, for his excellent guidance and invaluable support, </w:t>
       </w:r>
       <w:r>
         <w:rPr>
@@ -5052,7 +5036,7 @@
               <w:rPr>
                 <w:noProof/>
               </w:rPr>
-              <w:t>53</w:t>
+              <w:t>51</w:t>
             </w:r>
             <w:r>
               <w:fldChar w:fldCharType="end"/>
@@ -7450,13 +7434,8 @@
           </w:tcPr>
           <w:p>
             <w:r>
-              <w:t xml:space="preserve">Search and </w:t>
-            </w:r>
-            <w:proofErr w:type="gramStart"/>
-            <w:r>
-              <w:t>Rescue</w:t>
-            </w:r>
-            <w:proofErr w:type="gramEnd"/>
+              <w:t>Search and Rescue</w:t>
+            </w:r>
           </w:p>
         </w:tc>
       </w:tr>
@@ -8062,8 +8041,8 @@
           <w:szCs w:val="32"/>
         </w:rPr>
       </w:pPr>
-      <w:bookmarkStart w:id="7" w:name="bm_introduction"/>
-      <w:bookmarkStart w:id="8" w:name="bm_abstract"/>
+      <w:bookmarkStart w:id="7" w:name="bm_abstract"/>
+      <w:bookmarkStart w:id="8" w:name="bm_introduction"/>
       <w:r>
         <w:br w:type="page"/>
       </w:r>
@@ -8076,7 +8055,7 @@
         <w:lastRenderedPageBreak/>
         <w:t>ABSTRACT</w:t>
       </w:r>
-      <w:bookmarkEnd w:id="8"/>
+      <w:bookmarkEnd w:id="7"/>
     </w:p>
     <w:p>
       <w:pPr>
@@ -8137,7 +8116,7 @@
       <w:r>
         <w:t>INTRODUCTION</w:t>
       </w:r>
-      <w:bookmarkEnd w:id="7"/>
+      <w:bookmarkEnd w:id="8"/>
       <w:bookmarkEnd w:id="9"/>
     </w:p>
     <w:p>
@@ -8952,15 +8931,7 @@
       </w:r>
       <w:proofErr w:type="spellEnd"/>
       <w:r>
-        <w:t xml:space="preserve">, charge station for drones; </w:t>
-      </w:r>
-      <w:proofErr w:type="gramStart"/>
-      <w:r>
-        <w:t>plus</w:t>
-      </w:r>
-      <w:proofErr w:type="gramEnd"/>
-      <w:r>
-        <w:t xml:space="preserve"> nearest victim and debris for rover). Implement epsilon-greedy selection with exponential decay.</w:t>
+        <w:t>, charge station for drones; plus nearest victim and debris for rover). Implement epsilon-greedy selection with exponential decay.</w:t>
       </w:r>
     </w:p>
     <w:p>
@@ -9767,15 +9738,7 @@
         <w:jc w:val="both"/>
       </w:pPr>
       <w:r>
-        <w:t xml:space="preserve">Hierarchical reinforcement learning decomposes the decision-making problem across multiple levels of temporal abstraction. The options framework formalized by Sutton, Precup, and Singh defines temporally extended actions as triples consisting of an initiation set, an intra-option policy, and a termination condition. Feudal Networks decompose the policy into a </w:t>
-      </w:r>
-      <w:proofErr w:type="gramStart"/>
-      <w:r>
-        <w:t>Manager</w:t>
-      </w:r>
-      <w:proofErr w:type="gramEnd"/>
-      <w:r>
-        <w:t xml:space="preserve"> network generating subgoals for Worker networks. The Options-Critic architecture enables end-to-end learning of both option policies and termination functions. These approaches have demonstrated significantly improved sample efficiency on tasks with long temporal horizons and sparse reward signals, as the hierarchical structure enables the higher-level policy to reason across extended time periods without requiring a dense reward signal at every primitive action step [4], [14].</w:t>
+        <w:t>Hierarchical reinforcement learning decomposes the decision-making problem across multiple levels of temporal abstraction. The options framework formalized by Sutton, Precup, and Singh defines temporally extended actions as triples consisting of an initiation set, an intra-option policy, and a termination condition. Feudal Networks decompose the policy into a Manager network generating subgoals for Worker networks. The Options-Critic architecture enables end-to-end learning of both option policies and termination functions. These approaches have demonstrated significantly improved sample efficiency on tasks with long temporal horizons and sparse reward signals, as the hierarchical structure enables the higher-level policy to reason across extended time periods without requiring a dense reward signal at every primitive action step [4], [14].</w:t>
       </w:r>
     </w:p>
     <w:p>
@@ -10265,15 +10228,7 @@
         <w:jc w:val="both"/>
       </w:pPr>
       <w:r>
-        <w:t xml:space="preserve">Sutton and Barto's comprehensive textbook </w:t>
-      </w:r>
-      <w:proofErr w:type="gramStart"/>
-      <w:r>
-        <w:t>provides</w:t>
-      </w:r>
-      <w:proofErr w:type="gramEnd"/>
-      <w:r>
-        <w:t xml:space="preserve"> the theoretical foundations for both tabular and function approximation reinforcement learning methods used in the EMARL-SAR framework. The Bellman optimality equations for Q-values provide the theoretical basis for the Q-table update rule used in the high-level agent. The temporal difference learning framework justifies the TD error minimization objective used in DQN training. The epsilon-greedy exploration strategy with decay scheduling, implemented in both the high-level and low-level agents, is presented and </w:t>
+        <w:t xml:space="preserve">Sutton and Barto's comprehensive textbook provides the theoretical foundations for both tabular and function approximation reinforcement learning methods used in the EMARL-SAR framework. The Bellman optimality equations for Q-values provide the theoretical basis for the Q-table update rule used in the high-level agent. The temporal difference learning framework justifies the TD error minimization objective used in DQN training. The epsilon-greedy exploration strategy with decay scheduling, implemented in both the high-level and low-level agents, is presented and </w:t>
       </w:r>
       <w:proofErr w:type="spellStart"/>
       <w:r>
@@ -14859,22 +14814,23 @@
       <w:pPr>
         <w:pStyle w:val="Heading2"/>
       </w:pPr>
-      <w:bookmarkStart w:id="93" w:name="bm_3_7_mathematical_model"/>
+      <w:bookmarkStart w:id="93" w:name="bm_3_9_hardware_and_software_requireme"/>
+      <w:bookmarkStart w:id="94" w:name="bm_3_7_mathematical_model"/>
       <w:r>
         <w:lastRenderedPageBreak/>
         <w:t>3.7 Mathematical Model</w:t>
       </w:r>
-      <w:bookmarkEnd w:id="93"/>
+      <w:bookmarkEnd w:id="94"/>
     </w:p>
     <w:p>
       <w:pPr>
         <w:pStyle w:val="Heading3"/>
       </w:pPr>
-      <w:bookmarkStart w:id="94" w:name="bm_3_7_1_cooperative_semi_markov_decis"/>
+      <w:bookmarkStart w:id="95" w:name="bm_3_7_1_cooperative_semi_markov_decis"/>
       <w:r>
         <w:t>3.7.1 Cooperative Semi-Markov Decision Process Formulation</w:t>
       </w:r>
-      <w:bookmarkEnd w:id="94"/>
+      <w:bookmarkEnd w:id="95"/>
     </w:p>
     <w:p>
       <w:pPr>
@@ -14985,11 +14941,11 @@
       <w:pPr>
         <w:pStyle w:val="Heading3"/>
       </w:pPr>
-      <w:bookmarkStart w:id="95" w:name="bm_3_7_2_high_level_q_table_update_smd"/>
+      <w:bookmarkStart w:id="96" w:name="bm_3_7_2_high_level_q_table_update_smd"/>
       <w:r>
         <w:t>3.7.2 High-Level Q-Table Update (SMDP Bellman Equation)</w:t>
       </w:r>
-      <w:bookmarkEnd w:id="95"/>
+      <w:bookmarkEnd w:id="96"/>
     </w:p>
     <w:p>
       <w:pPr>
@@ -15018,64 +14974,305 @@
     </w:p>
     <w:p>
       <w:pPr>
+        <w:spacing w:before="180" w:after="180" w:line="360" w:lineRule="auto"/>
+        <w:jc w:val="center"/>
+      </w:pPr>
+      <m:oMathPara>
+        <m:oMath>
+          <m:sSub>
+            <m:sSubPr>
+              <m:ctrlPr>
+                <w:rPr>
+                  <w:rFonts w:ascii="Cambria Math" w:hAnsi="Cambria Math"/>
+                </w:rPr>
+              </m:ctrlPr>
+            </m:sSubPr>
+            <m:e>
+              <m:r>
+                <w:rPr>
+                  <w:rFonts w:ascii="Cambria Math" w:hAnsi="Cambria Math"/>
+                </w:rPr>
+                <m:t>Q</m:t>
+              </m:r>
+            </m:e>
+            <m:sub>
+              <m:r>
+                <w:rPr>
+                  <w:rFonts w:ascii="Cambria Math" w:hAnsi="Cambria Math"/>
+                </w:rPr>
+                <m:t>H</m:t>
+              </m:r>
+            </m:sub>
+          </m:sSub>
+          <m:r>
+            <w:rPr>
+              <w:rFonts w:ascii="Cambria Math" w:hAnsi="Cambria Math"/>
+            </w:rPr>
+            <m:t xml:space="preserve">(s, o) ← </m:t>
+          </m:r>
+          <m:sSub>
+            <m:sSubPr>
+              <m:ctrlPr>
+                <w:rPr>
+                  <w:rFonts w:ascii="Cambria Math" w:hAnsi="Cambria Math"/>
+                </w:rPr>
+              </m:ctrlPr>
+            </m:sSubPr>
+            <m:e>
+              <m:r>
+                <w:rPr>
+                  <w:rFonts w:ascii="Cambria Math" w:hAnsi="Cambria Math"/>
+                </w:rPr>
+                <m:t>Q</m:t>
+              </m:r>
+            </m:e>
+            <m:sub>
+              <m:r>
+                <w:rPr>
+                  <w:rFonts w:ascii="Cambria Math" w:hAnsi="Cambria Math"/>
+                </w:rPr>
+                <m:t>H</m:t>
+              </m:r>
+            </m:sub>
+          </m:sSub>
+          <m:r>
+            <w:rPr>
+              <w:rFonts w:ascii="Cambria Math" w:hAnsi="Cambria Math"/>
+            </w:rPr>
+            <m:t>(s, o) + α · [</m:t>
+          </m:r>
+          <m:sSub>
+            <m:sSubPr>
+              <m:ctrlPr>
+                <w:rPr>
+                  <w:rFonts w:ascii="Cambria Math" w:hAnsi="Cambria Math"/>
+                </w:rPr>
+              </m:ctrlPr>
+            </m:sSubPr>
+            <m:e>
+              <m:r>
+                <w:rPr>
+                  <w:rFonts w:ascii="Cambria Math" w:hAnsi="Cambria Math"/>
+                </w:rPr>
+                <m:t>R</m:t>
+              </m:r>
+            </m:e>
+            <m:sub>
+              <m:r>
+                <w:rPr>
+                  <w:rFonts w:ascii="Cambria Math" w:hAnsi="Cambria Math"/>
+                </w:rPr>
+                <m:t>accumulated</m:t>
+              </m:r>
+            </m:sub>
+          </m:sSub>
+          <m:r>
+            <w:rPr>
+              <w:rFonts w:ascii="Cambria Math" w:hAnsi="Cambria Math"/>
+            </w:rPr>
+            <m:t xml:space="preserve"> + </m:t>
+          </m:r>
+          <m:sSubSup>
+            <m:sSubSupPr>
+              <m:ctrlPr>
+                <w:rPr>
+                  <w:rFonts w:ascii="Cambria Math" w:hAnsi="Cambria Math"/>
+                </w:rPr>
+              </m:ctrlPr>
+            </m:sSubSupPr>
+            <m:e>
+              <m:r>
+                <w:rPr>
+                  <w:rFonts w:ascii="Cambria Math" w:hAnsi="Cambria Math"/>
+                </w:rPr>
+                <m:t>γ</m:t>
+              </m:r>
+            </m:e>
+            <m:sub>
+              <m:r>
+                <w:rPr>
+                  <w:rFonts w:ascii="Cambria Math" w:hAnsi="Cambria Math"/>
+                </w:rPr>
+                <m:t>H</m:t>
+              </m:r>
+            </m:sub>
+            <m:sup>
+              <m:r>
+                <w:rPr>
+                  <w:rFonts w:ascii="Cambria Math" w:hAnsi="Cambria Math"/>
+                </w:rPr>
+                <m:t>τ</m:t>
+              </m:r>
+            </m:sup>
+          </m:sSubSup>
+          <m:r>
+            <w:rPr>
+              <w:rFonts w:ascii="Cambria Math" w:hAnsi="Cambria Math"/>
+            </w:rPr>
+            <m:t xml:space="preserve"> · </m:t>
+          </m:r>
+          <m:sSub>
+            <m:sSubPr>
+              <m:ctrlPr>
+                <w:rPr>
+                  <w:rFonts w:ascii="Cambria Math" w:hAnsi="Cambria Math"/>
+                </w:rPr>
+              </m:ctrlPr>
+            </m:sSubPr>
+            <m:e>
+              <m:r>
+                <w:rPr>
+                  <w:rFonts w:ascii="Cambria Math" w:hAnsi="Cambria Math"/>
+                </w:rPr>
+                <m:t>max</m:t>
+              </m:r>
+            </m:e>
+            <m:sub>
+              <m:r>
+                <w:rPr>
+                  <w:rFonts w:ascii="Cambria Math" w:hAnsi="Cambria Math"/>
+                </w:rPr>
+                <m:t>o'</m:t>
+              </m:r>
+            </m:sub>
+          </m:sSub>
+          <m:r>
+            <w:rPr>
+              <w:rFonts w:ascii="Cambria Math" w:hAnsi="Cambria Math"/>
+            </w:rPr>
+            <m:t xml:space="preserve"> </m:t>
+          </m:r>
+          <m:sSub>
+            <m:sSubPr>
+              <m:ctrlPr>
+                <w:rPr>
+                  <w:rFonts w:ascii="Cambria Math" w:hAnsi="Cambria Math"/>
+                </w:rPr>
+              </m:ctrlPr>
+            </m:sSubPr>
+            <m:e>
+              <m:r>
+                <w:rPr>
+                  <w:rFonts w:ascii="Cambria Math" w:hAnsi="Cambria Math"/>
+                </w:rPr>
+                <m:t>Q</m:t>
+              </m:r>
+            </m:e>
+            <m:sub>
+              <m:r>
+                <w:rPr>
+                  <w:rFonts w:ascii="Cambria Math" w:hAnsi="Cambria Math"/>
+                </w:rPr>
+                <m:t>H</m:t>
+              </m:r>
+            </m:sub>
+          </m:sSub>
+          <m:r>
+            <w:rPr>
+              <w:rFonts w:ascii="Cambria Math" w:hAnsi="Cambria Math"/>
+            </w:rPr>
+            <m:t xml:space="preserve">(s', o') - </m:t>
+          </m:r>
+          <m:sSub>
+            <m:sSubPr>
+              <m:ctrlPr>
+                <w:rPr>
+                  <w:rFonts w:ascii="Cambria Math" w:hAnsi="Cambria Math"/>
+                </w:rPr>
+              </m:ctrlPr>
+            </m:sSubPr>
+            <m:e>
+              <m:r>
+                <w:rPr>
+                  <w:rFonts w:ascii="Cambria Math" w:hAnsi="Cambria Math"/>
+                </w:rPr>
+                <m:t>Q</m:t>
+              </m:r>
+            </m:e>
+            <m:sub>
+              <m:r>
+                <w:rPr>
+                  <w:rFonts w:ascii="Cambria Math" w:hAnsi="Cambria Math"/>
+                </w:rPr>
+                <m:t>H</m:t>
+              </m:r>
+            </m:sub>
+          </m:sSub>
+          <m:r>
+            <w:rPr>
+              <w:rFonts w:ascii="Cambria Math" w:hAnsi="Cambria Math"/>
+            </w:rPr>
+            <m:t>(s, o)]</m:t>
+          </m:r>
+        </m:oMath>
+      </m:oMathPara>
+    </w:p>
+    <w:p>
+      <w:pPr>
         <w:spacing w:after="180" w:line="360" w:lineRule="auto"/>
         <w:jc w:val="both"/>
       </w:pPr>
       <w:r>
-        <w:rPr>
-          <w:b/>
-          <w:bCs/>
-        </w:rPr>
-        <w:t xml:space="preserve">      Q_H(s, o) ← Q_H(s, o) + α · [</w:t>
-      </w:r>
-      <w:proofErr w:type="spellStart"/>
-      <w:r>
-        <w:rPr>
-          <w:b/>
-          <w:bCs/>
-        </w:rPr>
+        <w:t xml:space="preserve">where α = 0.15 is the Q-table learning rate, </w:t>
+      </w:r>
+      <w:proofErr w:type="spellStart"/>
+      <w:r>
         <w:t>R_accumulated</w:t>
       </w:r>
       <w:proofErr w:type="spellEnd"/>
       <w:r>
-        <w:rPr>
-          <w:b/>
-          <w:bCs/>
-        </w:rPr>
-        <w:t xml:space="preserve"> + </w:t>
-      </w:r>
-      <w:proofErr w:type="spellStart"/>
-      <w:r>
-        <w:rPr>
-          <w:b/>
-          <w:bCs/>
-        </w:rPr>
+        <w:t xml:space="preserve"> = Σ_{t=0}^{k-1} </w:t>
+      </w:r>
+      <w:proofErr w:type="spellStart"/>
+      <w:r>
+        <w:t>r_t</w:t>
+      </w:r>
+      <w:proofErr w:type="spellEnd"/>
+      <w:r>
+        <w:t xml:space="preserve"> is the total reward accumulated across all k primitive action steps during option </w:t>
+      </w:r>
+      <w:proofErr w:type="spellStart"/>
+      <w:r>
+        <w:t>o</w:t>
+      </w:r>
+      <w:proofErr w:type="spellEnd"/>
+      <w:r>
+        <w:t xml:space="preserve"> execution, </w:t>
+      </w:r>
+      <w:proofErr w:type="spellStart"/>
+      <w:r>
         <w:t>γ_H</w:t>
       </w:r>
       <w:proofErr w:type="spellEnd"/>
       <w:r>
-        <w:rPr>
-          <w:b/>
-          <w:bCs/>
-        </w:rPr>
-        <w:t xml:space="preserve"> · </w:t>
-      </w:r>
-      <w:proofErr w:type="spellStart"/>
-      <w:r>
-        <w:rPr>
-          <w:b/>
-          <w:bCs/>
-        </w:rPr>
+        <w:t xml:space="preserve"> = 0.9 is the high-level discount factor, and s, s' are the discrete state tuples before and after option execution. The </w:t>
+      </w:r>
+      <w:proofErr w:type="spellStart"/>
+      <w:r>
         <w:t>max_o</w:t>
       </w:r>
       <w:proofErr w:type="spellEnd"/>
       <w:r>
-        <w:rPr>
-          <w:b/>
-          <w:bCs/>
-        </w:rPr>
-        <w:t>' Q_H(s', o') - Q_H(s, o)]</w:t>
-      </w:r>
+        <w:t xml:space="preserve">' term bootstraps the future value from the greedy macro-goal available at the terminating </w:t>
+      </w:r>
+      <w:proofErr w:type="spellStart"/>
+      <w:r>
+        <w:t>state s</w:t>
+      </w:r>
+      <w:proofErr w:type="spellEnd"/>
+      <w:r>
+        <w:t>', enabling the high-level policy to evaluate the long-term strategic value of macro-goal assignments [4], [6].</w:t>
+      </w:r>
+    </w:p>
+    <w:p>
+      <w:pPr>
+        <w:pStyle w:val="Heading3"/>
+      </w:pPr>
+      <w:bookmarkStart w:id="97" w:name="bm_3_7_3_low_level_dqn_loss_and_gradie"/>
+      <w:r>
+        <w:t>3.7.3 Low-Level DQN Loss and Gradient Update</w:t>
+      </w:r>
+      <w:bookmarkEnd w:id="97"/>
     </w:p>
     <w:p>
       <w:pPr>
@@ -15083,120 +15280,104 @@
         <w:jc w:val="both"/>
       </w:pPr>
       <w:r>
-        <w:t xml:space="preserve">where α = 0.15 is the Q-table learning rate, </w:t>
-      </w:r>
-      <w:proofErr w:type="spellStart"/>
-      <w:r>
-        <w:t>R_accumulated</w:t>
-      </w:r>
-      <w:proofErr w:type="spellEnd"/>
-      <w:r>
-        <w:t xml:space="preserve"> = Σ_{t=0}^{k-1} </w:t>
-      </w:r>
-      <w:proofErr w:type="spellStart"/>
-      <w:r>
-        <w:t>r_t</w:t>
-      </w:r>
-      <w:proofErr w:type="spellEnd"/>
-      <w:r>
-        <w:t xml:space="preserve"> is the total reward accumulated across all k primitive action steps during option </w:t>
-      </w:r>
-      <w:proofErr w:type="spellStart"/>
-      <w:r>
-        <w:t>o</w:t>
-      </w:r>
-      <w:proofErr w:type="spellEnd"/>
-      <w:r>
-        <w:t xml:space="preserve"> execution, </w:t>
-      </w:r>
-      <w:proofErr w:type="spellStart"/>
-      <w:r>
-        <w:t>γ_H</w:t>
-      </w:r>
-      <w:proofErr w:type="spellEnd"/>
-      <w:r>
-        <w:t xml:space="preserve"> = 0.9 is the high-level discount factor, and s, s' are the discrete state tuples before and after option execution. The </w:t>
-      </w:r>
-      <w:proofErr w:type="spellStart"/>
-      <w:r>
-        <w:t>max_o</w:t>
-      </w:r>
-      <w:proofErr w:type="spellEnd"/>
-      <w:r>
-        <w:t xml:space="preserve">' term bootstraps the future value from the greedy macro-goal available at the terminating </w:t>
-      </w:r>
-      <w:proofErr w:type="spellStart"/>
-      <w:r>
-        <w:t>state s</w:t>
-      </w:r>
-      <w:proofErr w:type="spellEnd"/>
-      <w:r>
-        <w:t>', enabling the high-level policy to evaluate the long-term strategic value of macro-goal assignments [4], [6].</w:t>
-      </w:r>
-    </w:p>
-    <w:p>
-      <w:pPr>
-        <w:pStyle w:val="Heading3"/>
-      </w:pPr>
-      <w:bookmarkStart w:id="96" w:name="bm_3_7_3_low_level_dqn_loss_and_gradie"/>
-      <w:r>
-        <w:t>3.7.3 Low-Level DQN Loss and Gradient Update</w:t>
-      </w:r>
-      <w:bookmarkEnd w:id="96"/>
-    </w:p>
-    <w:p>
-      <w:pPr>
-        <w:spacing w:after="180" w:line="360" w:lineRule="auto"/>
-        <w:jc w:val="both"/>
-      </w:pPr>
-      <w:r>
         <w:t>The low-level DQN policy network is trained by minimizing the temporal difference error. For a mini-batch of 64 transitions sampled from the experience replay buffer, the DQN loss is: [6], [14]</w:t>
       </w:r>
     </w:p>
     <w:p>
       <w:pPr>
-        <w:spacing w:after="180" w:line="360" w:lineRule="auto"/>
-        <w:jc w:val="both"/>
-      </w:pPr>
-      <w:r>
-        <w:rPr>
-          <w:b/>
-          <w:bCs/>
-        </w:rPr>
-        <w:t xml:space="preserve">      L(θ) = E_{(</w:t>
-      </w:r>
-      <w:proofErr w:type="spellStart"/>
-      <w:r>
-        <w:rPr>
-          <w:b/>
-          <w:bCs/>
-        </w:rPr>
-        <w:t>s,a,r,s',d</w:t>
-      </w:r>
-      <w:proofErr w:type="spellEnd"/>
-      <w:r>
-        <w:rPr>
-          <w:b/>
-          <w:bCs/>
-        </w:rPr>
-        <w:t xml:space="preserve">) ~ D} [ (y - </w:t>
-      </w:r>
-      <w:proofErr w:type="spellStart"/>
-      <w:r>
-        <w:rPr>
-          <w:b/>
-          <w:bCs/>
-        </w:rPr>
-        <w:t>Q_θ</w:t>
-      </w:r>
-      <w:proofErr w:type="spellEnd"/>
-      <w:r>
-        <w:rPr>
-          <w:b/>
-          <w:bCs/>
-        </w:rPr>
-        <w:t>(s, a))² ]</w:t>
-      </w:r>
+        <w:spacing w:before="180" w:after="180" w:line="360" w:lineRule="auto"/>
+        <w:jc w:val="center"/>
+      </w:pPr>
+      <m:oMathPara>
+        <m:oMath>
+          <m:r>
+            <w:rPr>
+              <w:rFonts w:ascii="Cambria Math" w:hAnsi="Cambria Math"/>
+            </w:rPr>
+            <m:t>L(θ) = E</m:t>
+          </m:r>
+          <m:sSub>
+            <m:sSubPr>
+              <m:ctrlPr>
+                <w:rPr>
+                  <w:rFonts w:ascii="Cambria Math" w:hAnsi="Cambria Math"/>
+                </w:rPr>
+              </m:ctrlPr>
+            </m:sSubPr>
+            <m:e/>
+            <m:sub>
+              <m:r>
+                <w:rPr>
+                  <w:rFonts w:ascii="Cambria Math" w:hAnsi="Cambria Math"/>
+                </w:rPr>
+                <m:t>(s,a,r,s',d) ~ D</m:t>
+              </m:r>
+            </m:sub>
+          </m:sSub>
+          <m:r>
+            <w:rPr>
+              <w:rFonts w:ascii="Cambria Math" w:hAnsi="Cambria Math"/>
+            </w:rPr>
+            <m:t xml:space="preserve"> [ (y - </m:t>
+          </m:r>
+          <m:sSub>
+            <m:sSubPr>
+              <m:ctrlPr>
+                <w:rPr>
+                  <w:rFonts w:ascii="Cambria Math" w:hAnsi="Cambria Math"/>
+                </w:rPr>
+              </m:ctrlPr>
+            </m:sSubPr>
+            <m:e>
+              <m:r>
+                <w:rPr>
+                  <w:rFonts w:ascii="Cambria Math" w:hAnsi="Cambria Math"/>
+                </w:rPr>
+                <m:t>Q</m:t>
+              </m:r>
+            </m:e>
+            <m:sub>
+              <m:r>
+                <w:rPr>
+                  <w:rFonts w:ascii="Cambria Math" w:hAnsi="Cambria Math"/>
+                </w:rPr>
+                <m:t>θ</m:t>
+              </m:r>
+            </m:sub>
+          </m:sSub>
+          <m:sSup>
+            <m:sSupPr>
+              <m:ctrlPr>
+                <w:rPr>
+                  <w:rFonts w:ascii="Cambria Math" w:hAnsi="Cambria Math"/>
+                </w:rPr>
+              </m:ctrlPr>
+            </m:sSupPr>
+            <m:e>
+              <m:r>
+                <w:rPr>
+                  <w:rFonts w:ascii="Cambria Math" w:hAnsi="Cambria Math"/>
+                </w:rPr>
+                <m:t>(s, a))</m:t>
+              </m:r>
+            </m:e>
+            <m:sup>
+              <m:r>
+                <w:rPr>
+                  <w:rFonts w:ascii="Cambria Math" w:hAnsi="Cambria Math"/>
+                </w:rPr>
+                <m:t>2</m:t>
+              </m:r>
+            </m:sup>
+          </m:sSup>
+          <m:r>
+            <w:rPr>
+              <w:rFonts w:ascii="Cambria Math" w:hAnsi="Cambria Math"/>
+            </w:rPr>
+            <m:t xml:space="preserve"> ]</m:t>
+          </m:r>
+        </m:oMath>
+      </m:oMathPara>
     </w:p>
     <w:p>
       <w:pPr>
@@ -15236,11 +15417,11 @@
       <w:pPr>
         <w:pStyle w:val="Heading3"/>
       </w:pPr>
-      <w:bookmarkStart w:id="97" w:name="bm_3_7_4_bfs_shortest_path_navigation"/>
+      <w:bookmarkStart w:id="98" w:name="bm_3_7_4_bfs_shortest_path_navigation"/>
       <w:r>
         <w:t>3.7.4 BFS Shortest-Path Navigation</w:t>
       </w:r>
-      <w:bookmarkEnd w:id="97"/>
+      <w:bookmarkEnd w:id="98"/>
     </w:p>
     <w:p>
       <w:pPr>
@@ -15295,11 +15476,11 @@
       <w:pPr>
         <w:pStyle w:val="Heading3"/>
       </w:pPr>
-      <w:bookmarkStart w:id="98" w:name="bm_3_7_5_gradient_saliency_attribution"/>
+      <w:bookmarkStart w:id="99" w:name="bm_3_7_5_gradient_saliency_attribution"/>
       <w:r>
         <w:t>3.7.5 Gradient Saliency Attribution</w:t>
       </w:r>
-      <w:bookmarkEnd w:id="98"/>
+      <w:bookmarkEnd w:id="99"/>
     </w:p>
     <w:p>
       <w:pPr>
@@ -15344,64 +15525,441 @@
     </w:p>
     <w:p>
       <w:pPr>
+        <w:spacing w:before="180" w:after="180" w:line="360" w:lineRule="auto"/>
+        <w:jc w:val="center"/>
+      </w:pPr>
+      <m:oMathPara>
+        <m:oMath>
+          <m:sSub>
+            <m:sSubPr>
+              <m:ctrlPr>
+                <w:rPr>
+                  <w:rFonts w:ascii="Cambria Math" w:hAnsi="Cambria Math"/>
+                </w:rPr>
+              </m:ctrlPr>
+            </m:sSubPr>
+            <m:e>
+              <m:r>
+                <w:rPr>
+                  <w:rFonts w:ascii="Cambria Math" w:hAnsi="Cambria Math"/>
+                </w:rPr>
+                <m:t>saliency</m:t>
+              </m:r>
+            </m:e>
+            <m:sub>
+              <m:r>
+                <w:rPr>
+                  <w:rFonts w:ascii="Cambria Math" w:hAnsi="Cambria Math"/>
+                </w:rPr>
+                <m:t>j</m:t>
+              </m:r>
+            </m:sub>
+          </m:sSub>
+          <m:r>
+            <w:rPr>
+              <w:rFonts w:ascii="Cambria Math" w:hAnsi="Cambria Math"/>
+            </w:rPr>
+            <m:t xml:space="preserve"> = |</m:t>
+          </m:r>
+          <m:f>
+            <m:fPr>
+              <m:ctrlPr>
+                <w:rPr>
+                  <w:rFonts w:ascii="Cambria Math" w:hAnsi="Cambria Math"/>
+                </w:rPr>
+              </m:ctrlPr>
+            </m:fPr>
+            <m:num>
+              <m:r>
+                <w:rPr>
+                  <w:rFonts w:ascii="Cambria Math" w:hAnsi="Cambria Math"/>
+                </w:rPr>
+                <m:t>∂</m:t>
+              </m:r>
+              <m:sSub>
+                <m:sSubPr>
+                  <m:ctrlPr>
+                    <w:rPr>
+                      <w:rFonts w:ascii="Cambria Math" w:hAnsi="Cambria Math"/>
+                    </w:rPr>
+                  </m:ctrlPr>
+                </m:sSubPr>
+                <m:e>
+                  <m:r>
+                    <w:rPr>
+                      <w:rFonts w:ascii="Cambria Math" w:hAnsi="Cambria Math"/>
+                    </w:rPr>
+                    <m:t>Q</m:t>
+                  </m:r>
+                </m:e>
+                <m:sub>
+                  <m:r>
+                    <w:rPr>
+                      <w:rFonts w:ascii="Cambria Math" w:hAnsi="Cambria Math"/>
+                    </w:rPr>
+                    <m:t>θ</m:t>
+                  </m:r>
+                </m:sub>
+              </m:sSub>
+              <m:sSup>
+                <m:sSupPr>
+                  <m:ctrlPr>
+                    <w:rPr>
+                      <w:rFonts w:ascii="Cambria Math" w:hAnsi="Cambria Math"/>
+                    </w:rPr>
+                  </m:ctrlPr>
+                </m:sSupPr>
+                <m:e>
+                  <m:r>
+                    <w:rPr>
+                      <w:rFonts w:ascii="Cambria Math" w:hAnsi="Cambria Math"/>
+                    </w:rPr>
+                    <m:t>(s, a</m:t>
+                  </m:r>
+                </m:e>
+                <m:sup>
+                  <m:r>
+                    <w:rPr>
+                      <w:rFonts w:ascii="Cambria Math" w:hAnsi="Cambria Math"/>
+                    </w:rPr>
+                    <m:t>*</m:t>
+                  </m:r>
+                </m:sup>
+              </m:sSup>
+              <m:r>
+                <w:rPr>
+                  <w:rFonts w:ascii="Cambria Math" w:hAnsi="Cambria Math"/>
+                </w:rPr>
+                <m:t>)</m:t>
+              </m:r>
+            </m:num>
+            <m:den>
+              <m:r>
+                <w:rPr>
+                  <w:rFonts w:ascii="Cambria Math" w:hAnsi="Cambria Math"/>
+                </w:rPr>
+                <m:t>∂</m:t>
+              </m:r>
+              <m:sSub>
+                <m:sSubPr>
+                  <m:ctrlPr>
+                    <w:rPr>
+                      <w:rFonts w:ascii="Cambria Math" w:hAnsi="Cambria Math"/>
+                    </w:rPr>
+                  </m:ctrlPr>
+                </m:sSubPr>
+                <m:e>
+                  <m:r>
+                    <w:rPr>
+                      <w:rFonts w:ascii="Cambria Math" w:hAnsi="Cambria Math"/>
+                    </w:rPr>
+                    <m:t>s</m:t>
+                  </m:r>
+                </m:e>
+                <m:sub>
+                  <m:r>
+                    <w:rPr>
+                      <w:rFonts w:ascii="Cambria Math" w:hAnsi="Cambria Math"/>
+                    </w:rPr>
+                    <m:t>j</m:t>
+                  </m:r>
+                </m:sub>
+              </m:sSub>
+            </m:den>
+          </m:f>
+          <m:r>
+            <w:rPr>
+              <w:rFonts w:ascii="Cambria Math" w:hAnsi="Cambria Math"/>
+            </w:rPr>
+            <m:t>|  for j = 0, 1, ..., 11</m:t>
+          </m:r>
+        </m:oMath>
+      </m:oMathPara>
+    </w:p>
+    <w:p>
+      <w:pPr>
         <w:spacing w:after="180" w:line="360" w:lineRule="auto"/>
         <w:jc w:val="both"/>
       </w:pPr>
       <w:r>
-        <w:rPr>
-          <w:b/>
-          <w:bCs/>
-        </w:rPr>
-        <w:t xml:space="preserve">      </w:t>
-      </w:r>
-      <w:proofErr w:type="spellStart"/>
-      <w:r>
-        <w:rPr>
-          <w:b/>
-          <w:bCs/>
-        </w:rPr>
-        <w:t>saliency_j</w:t>
-      </w:r>
-      <w:proofErr w:type="spellEnd"/>
-      <w:r>
-        <w:rPr>
-          <w:b/>
-          <w:bCs/>
-        </w:rPr>
-        <w:t xml:space="preserve"> = |∂</w:t>
-      </w:r>
-      <w:proofErr w:type="spellStart"/>
-      <w:r>
-        <w:rPr>
-          <w:b/>
-          <w:bCs/>
-        </w:rPr>
-        <w:t>Q_θ</w:t>
-      </w:r>
-      <w:proofErr w:type="spellEnd"/>
-      <w:r>
-        <w:rPr>
-          <w:b/>
-          <w:bCs/>
-        </w:rPr>
-        <w:t>(s, a*) / ∂</w:t>
-      </w:r>
-      <w:proofErr w:type="spellStart"/>
-      <w:r>
-        <w:rPr>
-          <w:b/>
-          <w:bCs/>
-        </w:rPr>
-        <w:t>s_j</w:t>
-      </w:r>
-      <w:proofErr w:type="spellEnd"/>
-      <w:r>
-        <w:rPr>
-          <w:b/>
-          <w:bCs/>
-        </w:rPr>
-        <w:t>|  for j = 0, 1, ..., 11</w:t>
-      </w:r>
+        <w:t>The 12 gradient magnitudes are grouped into three semantic feature categories: [4], [6]</w:t>
+      </w:r>
+    </w:p>
+    <w:p>
+      <w:pPr>
+        <w:spacing w:before="180" w:after="180" w:line="360" w:lineRule="auto"/>
+        <w:jc w:val="center"/>
+      </w:pPr>
+      <m:oMathPara>
+        <m:oMath>
+          <m:sSub>
+            <m:sSubPr>
+              <m:ctrlPr>
+                <w:rPr>
+                  <w:rFonts w:ascii="Cambria Math" w:hAnsi="Cambria Math"/>
+                </w:rPr>
+              </m:ctrlPr>
+            </m:sSubPr>
+            <m:e>
+              <m:r>
+                <w:rPr>
+                  <w:rFonts w:ascii="Cambria Math" w:hAnsi="Cambria Math"/>
+                </w:rPr>
+                <m:t>W</m:t>
+              </m:r>
+            </m:e>
+            <m:sub>
+              <m:r>
+                <w:rPr>
+                  <w:rFonts w:ascii="Cambria Math" w:hAnsi="Cambria Math"/>
+                </w:rPr>
+                <m:t>target</m:t>
+              </m:r>
+            </m:sub>
+          </m:sSub>
+          <m:r>
+            <w:rPr>
+              <w:rFonts w:ascii="Cambria Math" w:hAnsi="Cambria Math"/>
+            </w:rPr>
+            <m:t xml:space="preserve"> = </m:t>
+          </m:r>
+          <m:sSub>
+            <m:sSubPr>
+              <m:ctrlPr>
+                <w:rPr>
+                  <w:rFonts w:ascii="Cambria Math" w:hAnsi="Cambria Math"/>
+                </w:rPr>
+              </m:ctrlPr>
+            </m:sSubPr>
+            <m:e>
+              <m:r>
+                <w:rPr>
+                  <w:rFonts w:ascii="Cambria Math" w:hAnsi="Cambria Math"/>
+                </w:rPr>
+                <m:t>saliency</m:t>
+              </m:r>
+            </m:e>
+            <m:sub>
+              <m:r>
+                <w:rPr>
+                  <w:rFonts w:ascii="Cambria Math" w:hAnsi="Cambria Math"/>
+                </w:rPr>
+                <m:t>0</m:t>
+              </m:r>
+            </m:sub>
+          </m:sSub>
+          <m:r>
+            <w:rPr>
+              <w:rFonts w:ascii="Cambria Math" w:hAnsi="Cambria Math"/>
+            </w:rPr>
+            <m:t xml:space="preserve"> + </m:t>
+          </m:r>
+          <m:sSub>
+            <m:sSubPr>
+              <m:ctrlPr>
+                <w:rPr>
+                  <w:rFonts w:ascii="Cambria Math" w:hAnsi="Cambria Math"/>
+                </w:rPr>
+              </m:ctrlPr>
+            </m:sSubPr>
+            <m:e>
+              <m:r>
+                <w:rPr>
+                  <w:rFonts w:ascii="Cambria Math" w:hAnsi="Cambria Math"/>
+                </w:rPr>
+                <m:t>saliency</m:t>
+              </m:r>
+            </m:e>
+            <m:sub>
+              <m:r>
+                <w:rPr>
+                  <w:rFonts w:ascii="Cambria Math" w:hAnsi="Cambria Math"/>
+                </w:rPr>
+                <m:t>1</m:t>
+              </m:r>
+            </m:sub>
+          </m:sSub>
+          <m:r>
+            <w:rPr>
+              <w:rFonts w:ascii="Cambria Math" w:hAnsi="Cambria Math"/>
+            </w:rPr>
+            <m:t xml:space="preserve">   (sub-goal direction dx, dy)</m:t>
+          </m:r>
+        </m:oMath>
+      </m:oMathPara>
+    </w:p>
+    <w:p>
+      <w:pPr>
+        <w:spacing w:before="180" w:after="180" w:line="360" w:lineRule="auto"/>
+        <w:jc w:val="center"/>
+      </w:pPr>
+      <m:oMathPara>
+        <m:oMath>
+          <m:sSub>
+            <m:sSubPr>
+              <m:ctrlPr>
+                <w:rPr>
+                  <w:rFonts w:ascii="Cambria Math" w:hAnsi="Cambria Math"/>
+                </w:rPr>
+              </m:ctrlPr>
+            </m:sSubPr>
+            <m:e>
+              <m:r>
+                <w:rPr>
+                  <w:rFonts w:ascii="Cambria Math" w:hAnsi="Cambria Math"/>
+                </w:rPr>
+                <m:t>W</m:t>
+              </m:r>
+            </m:e>
+            <m:sub>
+              <m:r>
+                <w:rPr>
+                  <w:rFonts w:ascii="Cambria Math" w:hAnsi="Cambria Math"/>
+                </w:rPr>
+                <m:t>battery</m:t>
+              </m:r>
+            </m:sub>
+          </m:sSub>
+          <m:r>
+            <w:rPr>
+              <w:rFonts w:ascii="Cambria Math" w:hAnsi="Cambria Math"/>
+            </w:rPr>
+            <m:t xml:space="preserve"> = </m:t>
+          </m:r>
+          <m:sSub>
+            <m:sSubPr>
+              <m:ctrlPr>
+                <w:rPr>
+                  <w:rFonts w:ascii="Cambria Math" w:hAnsi="Cambria Math"/>
+                </w:rPr>
+              </m:ctrlPr>
+            </m:sSubPr>
+            <m:e>
+              <m:r>
+                <w:rPr>
+                  <w:rFonts w:ascii="Cambria Math" w:hAnsi="Cambria Math"/>
+                </w:rPr>
+                <m:t>saliency</m:t>
+              </m:r>
+            </m:e>
+            <m:sub>
+              <m:r>
+                <w:rPr>
+                  <w:rFonts w:ascii="Cambria Math" w:hAnsi="Cambria Math"/>
+                </w:rPr>
+                <m:t>2</m:t>
+              </m:r>
+            </m:sub>
+          </m:sSub>
+          <m:r>
+            <w:rPr>
+              <w:rFonts w:ascii="Cambria Math" w:hAnsi="Cambria Math"/>
+            </w:rPr>
+            <m:t xml:space="preserve">               (battery level)</m:t>
+          </m:r>
+        </m:oMath>
+      </m:oMathPara>
+    </w:p>
+    <w:p>
+      <w:pPr>
+        <w:spacing w:before="180" w:after="180" w:line="360" w:lineRule="auto"/>
+        <w:jc w:val="center"/>
+      </w:pPr>
+      <m:oMathPara>
+        <m:oMath>
+          <m:sSub>
+            <m:sSubPr>
+              <m:ctrlPr>
+                <w:rPr>
+                  <w:rFonts w:ascii="Cambria Math" w:hAnsi="Cambria Math"/>
+                </w:rPr>
+              </m:ctrlPr>
+            </m:sSubPr>
+            <m:e>
+              <m:r>
+                <w:rPr>
+                  <w:rFonts w:ascii="Cambria Math" w:hAnsi="Cambria Math"/>
+                </w:rPr>
+                <m:t>W</m:t>
+              </m:r>
+            </m:e>
+            <m:sub>
+              <m:r>
+                <w:rPr>
+                  <w:rFonts w:ascii="Cambria Math" w:hAnsi="Cambria Math"/>
+                </w:rPr>
+                <m:t>hazards</m:t>
+              </m:r>
+            </m:sub>
+          </m:sSub>
+          <m:r>
+            <w:rPr>
+              <w:rFonts w:ascii="Cambria Math" w:hAnsi="Cambria Math"/>
+            </w:rPr>
+            <m:t xml:space="preserve"> = </m:t>
+          </m:r>
+          <m:nary>
+            <m:naryPr>
+              <m:chr m:val="∑"/>
+              <m:limLoc m:val="undOvr"/>
+              <m:ctrlPr>
+                <w:rPr>
+                  <w:rFonts w:ascii="Cambria Math" w:hAnsi="Cambria Math"/>
+                </w:rPr>
+              </m:ctrlPr>
+            </m:naryPr>
+            <m:sub>
+              <m:r>
+                <w:rPr>
+                  <w:rFonts w:ascii="Cambria Math" w:hAnsi="Cambria Math"/>
+                </w:rPr>
+                <m:t>j=3</m:t>
+              </m:r>
+            </m:sub>
+            <m:sup>
+              <m:r>
+                <w:rPr>
+                  <w:rFonts w:ascii="Cambria Math" w:hAnsi="Cambria Math"/>
+                </w:rPr>
+                <m:t>11</m:t>
+              </m:r>
+            </m:sup>
+            <m:e>
+              <m:sSub>
+                <m:sSubPr>
+                  <m:ctrlPr>
+                    <w:rPr>
+                      <w:rFonts w:ascii="Cambria Math" w:hAnsi="Cambria Math"/>
+                    </w:rPr>
+                  </m:ctrlPr>
+                </m:sSubPr>
+                <m:e>
+                  <m:r>
+                    <w:rPr>
+                      <w:rFonts w:ascii="Cambria Math" w:hAnsi="Cambria Math"/>
+                    </w:rPr>
+                    <m:t>saliency</m:t>
+                  </m:r>
+                </m:e>
+                <m:sub>
+                  <m:r>
+                    <w:rPr>
+                      <w:rFonts w:ascii="Cambria Math" w:hAnsi="Cambria Math"/>
+                    </w:rPr>
+                    <m:t>j</m:t>
+                  </m:r>
+                </m:sub>
+              </m:sSub>
+            </m:e>
+          </m:nary>
+          <m:r>
+            <w:rPr>
+              <w:rFonts w:ascii="Cambria Math" w:hAnsi="Cambria Math"/>
+            </w:rPr>
+            <m:t xml:space="preserve">  (3×3 local grid FOV cells)</m:t>
+          </m:r>
+        </m:oMath>
+      </m:oMathPara>
     </w:p>
     <w:p>
       <w:pPr>
@@ -15409,179 +15967,48 @@
         <w:jc w:val="both"/>
       </w:pPr>
       <w:r>
-        <w:t>The 12 gradient magnitudes are grouped into three semantic feature categories: [4], [6]</w:t>
-      </w:r>
-    </w:p>
-    <w:p>
-      <w:pPr>
-        <w:spacing w:after="180" w:line="360" w:lineRule="auto"/>
-        <w:jc w:val="both"/>
-      </w:pPr>
-      <w:r>
-        <w:rPr>
-          <w:b/>
-          <w:bCs/>
-        </w:rPr>
-        <w:t xml:space="preserve">      </w:t>
-      </w:r>
-      <w:proofErr w:type="spellStart"/>
-      <w:r>
-        <w:rPr>
-          <w:b/>
-          <w:bCs/>
-        </w:rPr>
+        <w:lastRenderedPageBreak/>
+        <w:t xml:space="preserve">The percentage attribution scores are computed as: </w:t>
+      </w:r>
+      <w:proofErr w:type="spellStart"/>
+      <w:r>
+        <w:t>P_k</w:t>
+      </w:r>
+      <w:proofErr w:type="spellEnd"/>
+      <w:r>
+        <w:t xml:space="preserve"> = (</w:t>
+      </w:r>
+      <w:proofErr w:type="spellStart"/>
+      <w:r>
+        <w:t>W_k</w:t>
+      </w:r>
+      <w:proofErr w:type="spellEnd"/>
+      <w:r>
+        <w:t xml:space="preserve"> / (</w:t>
+      </w:r>
+      <w:proofErr w:type="spellStart"/>
+      <w:r>
         <w:t>W_target</w:t>
       </w:r>
       <w:proofErr w:type="spellEnd"/>
       <w:r>
-        <w:rPr>
-          <w:b/>
-          <w:bCs/>
-        </w:rPr>
-        <w:t xml:space="preserve"> = saliency_0 + saliency_1   (sub-goal direction dx, </w:t>
-      </w:r>
-      <w:proofErr w:type="spellStart"/>
-      <w:r>
-        <w:rPr>
-          <w:b/>
-          <w:bCs/>
-        </w:rPr>
-        <w:t>dy</w:t>
-      </w:r>
-      <w:proofErr w:type="spellEnd"/>
-      <w:r>
-        <w:rPr>
-          <w:b/>
-          <w:bCs/>
-        </w:rPr>
-        <w:t>)</w:t>
-      </w:r>
-    </w:p>
-    <w:p>
-      <w:pPr>
-        <w:spacing w:after="180" w:line="360" w:lineRule="auto"/>
-        <w:jc w:val="both"/>
-      </w:pPr>
-      <w:r>
-        <w:rPr>
-          <w:b/>
-          <w:bCs/>
-        </w:rPr>
-        <w:t xml:space="preserve">      </w:t>
-      </w:r>
-      <w:proofErr w:type="spellStart"/>
-      <w:r>
-        <w:rPr>
-          <w:b/>
-          <w:bCs/>
-        </w:rPr>
+        <w:t xml:space="preserve"> + </w:t>
+      </w:r>
+      <w:proofErr w:type="spellStart"/>
+      <w:r>
         <w:t>W_battery</w:t>
       </w:r>
       <w:proofErr w:type="spellEnd"/>
       <w:r>
-        <w:rPr>
-          <w:b/>
-          <w:bCs/>
-        </w:rPr>
-        <w:t xml:space="preserve"> = saliency_2               (battery level)</w:t>
-      </w:r>
-    </w:p>
-    <w:p>
-      <w:pPr>
-        <w:spacing w:after="180" w:line="360" w:lineRule="auto"/>
-        <w:jc w:val="both"/>
-      </w:pPr>
-      <w:r>
-        <w:rPr>
-          <w:b/>
-          <w:bCs/>
-        </w:rPr>
-        <w:t xml:space="preserve">      </w:t>
-      </w:r>
-      <w:proofErr w:type="spellStart"/>
-      <w:r>
-        <w:rPr>
-          <w:b/>
-          <w:bCs/>
-        </w:rPr>
+        <w:t xml:space="preserve"> + </w:t>
+      </w:r>
+      <w:proofErr w:type="spellStart"/>
+      <w:r>
         <w:t>W_hazards</w:t>
       </w:r>
       <w:proofErr w:type="spellEnd"/>
       <w:r>
-        <w:rPr>
-          <w:b/>
-          <w:bCs/>
-        </w:rPr>
-        <w:t xml:space="preserve"> = Σ_{j=3}^{11} </w:t>
-      </w:r>
-      <w:proofErr w:type="spellStart"/>
-      <w:r>
-        <w:rPr>
-          <w:b/>
-          <w:bCs/>
-        </w:rPr>
-        <w:t>saliency_j</w:t>
-      </w:r>
-      <w:proofErr w:type="spellEnd"/>
-      <w:r>
-        <w:rPr>
-          <w:b/>
-          <w:bCs/>
-        </w:rPr>
-        <w:t xml:space="preserve">  (3×3 local grid FOV cells)</w:t>
-      </w:r>
-    </w:p>
-    <w:p>
-      <w:pPr>
-        <w:spacing w:after="180" w:line="360" w:lineRule="auto"/>
-        <w:jc w:val="both"/>
-      </w:pPr>
-      <w:r>
-        <w:t xml:space="preserve">The percentage attribution scores are computed as: </w:t>
-      </w:r>
-      <w:proofErr w:type="spellStart"/>
-      <w:r>
-        <w:t>P_k</w:t>
-      </w:r>
-      <w:proofErr w:type="spellEnd"/>
-      <w:r>
-        <w:t xml:space="preserve"> = (</w:t>
-      </w:r>
-      <w:proofErr w:type="spellStart"/>
-      <w:r>
-        <w:t>W_k</w:t>
-      </w:r>
-      <w:proofErr w:type="spellEnd"/>
-      <w:r>
-        <w:t xml:space="preserve"> / (</w:t>
-      </w:r>
-      <w:proofErr w:type="spellStart"/>
-      <w:r>
-        <w:t>W_target</w:t>
-      </w:r>
-      <w:proofErr w:type="spellEnd"/>
-      <w:r>
-        <w:t xml:space="preserve"> + </w:t>
-      </w:r>
-      <w:proofErr w:type="spellStart"/>
-      <w:r>
-        <w:t>W_battery</w:t>
-      </w:r>
-      <w:proofErr w:type="spellEnd"/>
-      <w:r>
-        <w:t xml:space="preserve"> + </w:t>
-      </w:r>
-      <w:proofErr w:type="spellStart"/>
-      <w:r>
-        <w:t>W_hazards</w:t>
-      </w:r>
-      <w:proofErr w:type="spellEnd"/>
-      <w:r>
-        <w:t xml:space="preserve"> + ε)) × 100% for k ∈ {target, battery, hazards}, where ε = 1e-6 prevents division by zero. The final percentages are adjusted so they </w:t>
-      </w:r>
-      <w:r>
-        <w:lastRenderedPageBreak/>
-        <w:t xml:space="preserve">sum exactly to 100% by adding the rounding residual to </w:t>
+        <w:t xml:space="preserve"> + ε)) × 100% for k ∈ {target, battery, hazards}, where ε = 1e-6 prevents division by zero. The final percentages are adjusted so they sum exactly to 100% by adding the rounding residual to </w:t>
       </w:r>
       <w:proofErr w:type="spellStart"/>
       <w:r>
@@ -15596,18 +16023,18 @@
       <w:pPr>
         <w:pStyle w:val="Heading2"/>
       </w:pPr>
-      <w:bookmarkStart w:id="99" w:name="bm_3_8_technologies_used"/>
+      <w:bookmarkStart w:id="100" w:name="bm_3_8_technologies_used"/>
       <w:r>
         <w:t>3.8 Technologies Used</w:t>
       </w:r>
-      <w:bookmarkEnd w:id="99"/>
+      <w:bookmarkEnd w:id="100"/>
     </w:p>
     <w:p>
       <w:pPr>
         <w:pStyle w:val="ListParagraph"/>
         <w:numPr>
           <w:ilvl w:val="0"/>
-          <w:numId w:val="2"/>
+          <w:numId w:val="5"/>
         </w:numPr>
         <w:spacing w:after="100" w:line="360" w:lineRule="auto"/>
       </w:pPr>
@@ -15620,7 +16047,7 @@
         <w:pStyle w:val="ListParagraph"/>
         <w:numPr>
           <w:ilvl w:val="0"/>
-          <w:numId w:val="2"/>
+          <w:numId w:val="5"/>
         </w:numPr>
         <w:spacing w:after="100" w:line="360" w:lineRule="auto"/>
       </w:pPr>
@@ -15654,7 +16081,7 @@
         <w:pStyle w:val="ListParagraph"/>
         <w:numPr>
           <w:ilvl w:val="0"/>
-          <w:numId w:val="2"/>
+          <w:numId w:val="5"/>
         </w:numPr>
         <w:spacing w:after="100" w:line="360" w:lineRule="auto"/>
       </w:pPr>
@@ -15667,7 +16094,7 @@
         <w:pStyle w:val="ListParagraph"/>
         <w:numPr>
           <w:ilvl w:val="0"/>
-          <w:numId w:val="2"/>
+          <w:numId w:val="5"/>
         </w:numPr>
         <w:spacing w:after="100" w:line="360" w:lineRule="auto"/>
       </w:pPr>
@@ -15696,7 +16123,7 @@
         <w:pStyle w:val="ListParagraph"/>
         <w:numPr>
           <w:ilvl w:val="0"/>
-          <w:numId w:val="2"/>
+          <w:numId w:val="5"/>
         </w:numPr>
         <w:spacing w:after="100" w:line="360" w:lineRule="auto"/>
       </w:pPr>
@@ -15717,7 +16144,7 @@
         <w:pStyle w:val="ListParagraph"/>
         <w:numPr>
           <w:ilvl w:val="0"/>
-          <w:numId w:val="2"/>
+          <w:numId w:val="5"/>
         </w:numPr>
         <w:spacing w:after="100" w:line="360" w:lineRule="auto"/>
       </w:pPr>
@@ -15730,7 +16157,7 @@
         <w:pStyle w:val="ListParagraph"/>
         <w:numPr>
           <w:ilvl w:val="0"/>
-          <w:numId w:val="2"/>
+          <w:numId w:val="5"/>
         </w:numPr>
         <w:spacing w:after="100" w:line="360" w:lineRule="auto"/>
       </w:pPr>
@@ -15744,14 +16171,19 @@
       </w:r>
     </w:p>
     <w:p>
+      <w:r>
+        <w:br w:type="page"/>
+      </w:r>
+    </w:p>
+    <w:p>
       <w:pPr>
         <w:pStyle w:val="Heading2"/>
       </w:pPr>
-      <w:bookmarkStart w:id="100" w:name="bm_3_9_hardware_and_software_requireme"/>
-      <w:r>
+      <w:r>
+        <w:lastRenderedPageBreak/>
         <w:t>3.9 Hardware and Software Requirements</w:t>
       </w:r>
-      <w:bookmarkEnd w:id="100"/>
+      <w:bookmarkEnd w:id="93"/>
     </w:p>
     <w:p>
       <w:pPr>
@@ -15957,7 +16389,6 @@
           </w:tcPr>
           <w:p>
             <w:r>
-              <w:lastRenderedPageBreak/>
               <w:t>Deep Learning Framework</w:t>
             </w:r>
           </w:p>
@@ -16568,19 +16999,11 @@
         <w:jc w:val="both"/>
       </w:pPr>
       <w:r>
-        <w:t xml:space="preserve">This chapter has presented the complete technical design and methodology of the EMARL-SAR framework. The proposed system overview described all five core modules and three heterogeneous agent configurations with their distinct role capabilities, positions, and reward structures. The working </w:t>
-      </w:r>
-      <w:proofErr w:type="gramStart"/>
-      <w:r>
-        <w:t>principle</w:t>
-      </w:r>
-      <w:proofErr w:type="gramEnd"/>
-      <w:r>
-        <w:t xml:space="preserve"> section detailed the full decision loop including high-level macro-goal assignment mechanics, low-level BFS-primary navigation with DQN fallback, and the environment's observation, mapping, and fire spread mechanics. The system architecture section presented the overall framework diagram and the two-level hierarchical policy structure. Detailed module descriptions aligned </w:t>
+        <w:t xml:space="preserve">This chapter has presented the complete technical design and methodology of the EMARL-SAR framework. The proposed system overview described all five core modules and three heterogeneous agent configurations with their distinct </w:t>
       </w:r>
       <w:r>
         <w:lastRenderedPageBreak/>
-        <w:t>precisely with the Python implementation covered all five modules including the environment, high-level Q-table agent, low-level DQN+BFS agent, explainability engine with all three explanation types, and the server and dashboard components. The system design section presented the SMDP training loop, environment lifecycle, and agent decision flow diagrams. The mathematical model formalized the Co-SMDP formulation, SMDP Bellman Q-update, DQN loss function, BFS pathfinding, and gradient saliency attribution. Technologies, software, and hardware requirements complete the methodology description. The following chapter presents the implementation details and experimental results [4], [6].</w:t>
+        <w:t>role capabilities, positions, and reward structures. The working principle section detailed the full decision loop including high-level macro-goal assignment mechanics, low-level BFS-primary navigation with DQN fallback, and the environment's observation, mapping, and fire spread mechanics. The system architecture section presented the overall framework diagram and the two-level hierarchical policy structure. Detailed module descriptions aligned precisely with the Python implementation covered all five modules including the environment, high-level Q-table agent, low-level DQN+BFS agent, explainability engine with all three explanation types, and the server and dashboard components. The system design section presented the SMDP training loop, environment lifecycle, and agent decision flow diagrams. The mathematical model formalized the Co-SMDP formulation, SMDP Bellman Q-update, DQN loss function, BFS pathfinding, and gradient saliency attribution. Technologies, software, and hardware requirements complete the methodology description. The following chapter presents the implementation details and experimental results [4], [6].</w:t>
       </w:r>
     </w:p>
     <w:p>
@@ -19820,15 +20243,7 @@
         <w:jc w:val="both"/>
       </w:pPr>
       <w:r>
-        <w:t xml:space="preserve">The SMDP training mechanism provides appropriate credit assignment for the high-level policy by accumulating rewards across the entire option execution duration. A successful victim rescue that occurred 20 steps after the rover was assigned a victim-targeting macro-goal generates a large accumulated reward (+40 plus </w:t>
-      </w:r>
-      <w:proofErr w:type="gramStart"/>
-      <w:r>
-        <w:t>+30 episode</w:t>
-      </w:r>
-      <w:proofErr w:type="gramEnd"/>
-      <w:r>
-        <w:t xml:space="preserve"> completion bonus) that is correctly attributed to the macro-goal selection decision through the SMDP Q-update, enabling the high-level policy to learn the high strategic value of victim-targeting macro-goals [1], [4].</w:t>
+        <w:t>The SMDP training mechanism provides appropriate credit assignment for the high-level policy by accumulating rewards across the entire option execution duration. A successful victim rescue that occurred 20 steps after the rover was assigned a victim-targeting macro-goal generates a large accumulated reward (+40 plus +30 episode completion bonus) that is correctly attributed to the macro-goal selection decision through the SMDP Q-update, enabling the high-level policy to learn the high strategic value of victim-targeting macro-goals [1], [4].</w:t>
       </w:r>
     </w:p>
     <w:p>
@@ -21260,6 +21675,60 @@
     </w:lvl>
   </w:abstractNum>
   <w:abstractNum w:abstractNumId="2" w15:restartNumberingAfterBreak="0">
+    <w:nsid w:val="4F58399D"/>
+    <w:multiLevelType w:val="hybridMultilevel"/>
+    <w:tmpl w:val="F1808652"/>
+    <w:lvl w:ilvl="0" w:tplc="987EC63C">
+      <w:start w:val="1"/>
+      <w:numFmt w:val="bullet"/>
+      <w:lvlText w:val="•"/>
+      <w:lvlJc w:val="left"/>
+      <w:pPr>
+        <w:ind w:left="720" w:hanging="360"/>
+      </w:pPr>
+    </w:lvl>
+    <w:lvl w:ilvl="1" w:tplc="81587D80">
+      <w:numFmt w:val="decimal"/>
+      <w:lvlText w:val=""/>
+      <w:lvlJc w:val="left"/>
+    </w:lvl>
+    <w:lvl w:ilvl="2" w:tplc="1F323EDE">
+      <w:numFmt w:val="decimal"/>
+      <w:lvlText w:val=""/>
+      <w:lvlJc w:val="left"/>
+    </w:lvl>
+    <w:lvl w:ilvl="3" w:tplc="36FEF920">
+      <w:numFmt w:val="decimal"/>
+      <w:lvlText w:val=""/>
+      <w:lvlJc w:val="left"/>
+    </w:lvl>
+    <w:lvl w:ilvl="4" w:tplc="DB421AD4">
+      <w:numFmt w:val="decimal"/>
+      <w:lvlText w:val=""/>
+      <w:lvlJc w:val="left"/>
+    </w:lvl>
+    <w:lvl w:ilvl="5" w:tplc="8F5EA6E0">
+      <w:numFmt w:val="decimal"/>
+      <w:lvlText w:val=""/>
+      <w:lvlJc w:val="left"/>
+    </w:lvl>
+    <w:lvl w:ilvl="6" w:tplc="6396115E">
+      <w:numFmt w:val="decimal"/>
+      <w:lvlText w:val=""/>
+      <w:lvlJc w:val="left"/>
+    </w:lvl>
+    <w:lvl w:ilvl="7" w:tplc="C498A7A2">
+      <w:numFmt w:val="decimal"/>
+      <w:lvlText w:val=""/>
+      <w:lvlJc w:val="left"/>
+    </w:lvl>
+    <w:lvl w:ilvl="8" w:tplc="9760D480">
+      <w:numFmt w:val="decimal"/>
+      <w:lvlText w:val=""/>
+      <w:lvlJc w:val="left"/>
+    </w:lvl>
+  </w:abstractNum>
+  <w:abstractNum w:abstractNumId="3" w15:restartNumberingAfterBreak="0">
     <w:nsid w:val="6614609C"/>
     <w:multiLevelType w:val="hybridMultilevel"/>
     <w:tmpl w:val="296432BE"/>
@@ -21326,12 +21795,18 @@
     </w:lvlOverride>
   </w:num>
   <w:num w:numId="3" w16cid:durableId="1337610066">
-    <w:abstractNumId w:val="2"/>
+    <w:abstractNumId w:val="3"/>
     <w:lvlOverride w:ilvl="0">
       <w:startOverride w:val="1"/>
     </w:lvlOverride>
   </w:num>
   <w:num w:numId="4" w16cid:durableId="609747825">
+    <w:abstractNumId w:val="3"/>
+    <w:lvlOverride w:ilvl="0">
+      <w:startOverride w:val="1"/>
+    </w:lvlOverride>
+  </w:num>
+  <w:num w:numId="5" w16cid:durableId="802232240">
     <w:abstractNumId w:val="2"/>
     <w:lvlOverride w:ilvl="0">
       <w:startOverride w:val="1"/>
@@ -21756,6 +22231,7 @@
   </w:style>
   <w:style w:type="paragraph" w:styleId="Heading2">
     <w:name w:val="heading 2"/>
+    <w:link w:val="Heading2Char"/>
     <w:uiPriority w:val="9"/>
     <w:unhideWhenUsed/>
     <w:qFormat/>
@@ -21829,6 +22305,7 @@
   <w:style w:type="character" w:default="1" w:styleId="DefaultParagraphFont">
     <w:name w:val="Default Paragraph Font"/>
     <w:uiPriority w:val="1"/>
+    <w:semiHidden/>
     <w:unhideWhenUsed/>
   </w:style>
   <w:style w:type="table" w:default="1" w:styleId="TableNormal">
@@ -22035,6 +22512,19 @@
       <w:bCs/>
       <w:sz w:val="32"/>
       <w:szCs w:val="32"/>
+    </w:rPr>
+  </w:style>
+  <w:style w:type="character" w:customStyle="1" w:styleId="Heading2Char">
+    <w:name w:val="Heading 2 Char"/>
+    <w:basedOn w:val="DefaultParagraphFont"/>
+    <w:link w:val="Heading2"/>
+    <w:uiPriority w:val="9"/>
+    <w:rsid w:val="00833C8F"/>
+    <w:rPr>
+      <w:b/>
+      <w:bCs/>
+      <w:sz w:val="28"/>
+      <w:szCs w:val="28"/>
     </w:rPr>
   </w:style>
 </w:styles>

</xml_diff>